<commit_message>
feat(Week05): docs and bai01 of the part 2
</commit_message>
<xml_diff>
--- a/22679171_NguyenPhanMinhMan_Week05.docx
+++ b/22679171_NguyenPhanMinhMan_Week05.docx
@@ -4,16 +4,37 @@
   <w:body>
     <w:p>
       <w:r>
-        <w:t>Họ và tên: Nguyễn Phan Minh Mẫn</w:t>
-      </w:r>
-    </w:p>
-    <w:p>
-      <w:r>
-        <w:t>MSSV: 22679171</w:t>
-      </w:r>
-    </w:p>
-    <w:p>
-      <w:r>
+        <w:rPr>
+          <w:b/>
+        </w:rPr>
+        <w:t>Họ và tên:</w:t>
+      </w:r>
+      <w:r>
+        <w:t xml:space="preserve"> Nguyễn Phan Minh Mẫn</w:t>
+      </w:r>
+    </w:p>
+    <w:p>
+      <w:r>
+        <w:rPr>
+          <w:b/>
+        </w:rPr>
+        <w:t>MSSV:</w:t>
+      </w:r>
+      <w:r>
+        <w:t xml:space="preserve"> 22679171</w:t>
+      </w:r>
+    </w:p>
+    <w:p>
+      <w:pPr>
+        <w:jc w:val="center"/>
+        <w:rPr>
+          <w:b/>
+        </w:rPr>
+      </w:pPr>
+      <w:r>
+        <w:rPr>
+          <w:b/>
+        </w:rPr>
         <w:t>Bài làm</w:t>
       </w:r>
     </w:p>
@@ -33,75 +54,19 @@
         <w:rPr>
           <w:rFonts w:ascii="Arial" w:hAnsi="Arial" w:cs="Arial"/>
         </w:rPr>
-        <w:t xml:space="preserve">Lệnh: </w:t>
-      </w:r>
-      <w:r>
-        <w:rPr>
-          <w:rFonts w:ascii="Arial" w:hAnsi="Arial" w:cs="Arial"/>
-        </w:rPr>
-        <w:t>docker --version</w:t>
-      </w:r>
-    </w:p>
-    <w:p>
-      <w:r>
+        <w:t>Lệnh: docker --version</w:t>
+      </w:r>
+    </w:p>
+    <w:p>
+      <w:r>
+        <w:rPr>
+          <w:noProof/>
+        </w:rPr>
         <w:drawing>
           <wp:inline distT="0" distB="0" distL="0" distR="0" wp14:anchorId="0A369DE9" wp14:editId="7EF72A43">
             <wp:extent cx="5943600" cy="3343275"/>
             <wp:effectExtent l="0" t="0" r="0" b="9525"/>
             <wp:docPr id="1" name="Picture 1"/>
-            <wp:cNvGraphicFramePr>
-              <a:graphicFrameLocks xmlns:a="http://schemas.openxmlformats.org/drawingml/2006/main" noChangeAspect="1"/>
-            </wp:cNvGraphicFramePr>
-            <a:graphic xmlns:a="http://schemas.openxmlformats.org/drawingml/2006/main">
-              <a:graphicData uri="http://schemas.openxmlformats.org/drawingml/2006/picture">
-                <pic:pic xmlns:pic="http://schemas.openxmlformats.org/drawingml/2006/picture">
-                  <pic:nvPicPr>
-                    <pic:cNvPr id="1" name=""/>
-                    <pic:cNvPicPr/>
-                  </pic:nvPicPr>
-                  <pic:blipFill>
-                    <a:blip r:embed="rId4"/>
-                    <a:stretch>
-                      <a:fillRect/>
-                    </a:stretch>
-                  </pic:blipFill>
-                  <pic:spPr>
-                    <a:xfrm>
-                      <a:off x="0" y="0"/>
-                      <a:ext cx="5943600" cy="3343275"/>
-                    </a:xfrm>
-                    <a:prstGeom prst="rect">
-                      <a:avLst/>
-                    </a:prstGeom>
-                  </pic:spPr>
-                </pic:pic>
-              </a:graphicData>
-            </a:graphic>
-          </wp:inline>
-        </w:drawing>
-      </w:r>
-    </w:p>
-    <w:p>
-      <w:pPr>
-        <w:pStyle w:val="Heading2"/>
-      </w:pPr>
-      <w:r>
-        <w:rPr>
-          <w:rFonts w:ascii="Arial" w:hAnsi="Arial" w:cs="Arial"/>
-        </w:rPr>
-        <w:lastRenderedPageBreak/>
-        <w:t>docker run hello-world</w:t>
-      </w:r>
-      <w:bookmarkStart w:id="0" w:name="_GoBack"/>
-      <w:bookmarkEnd w:id="0"/>
-    </w:p>
-    <w:p>
-      <w:r>
-        <w:drawing>
-          <wp:inline distT="0" distB="0" distL="0" distR="0" wp14:anchorId="78B083CB" wp14:editId="0813BCD5">
-            <wp:extent cx="5943600" cy="3343275"/>
-            <wp:effectExtent l="0" t="0" r="0" b="9525"/>
-            <wp:docPr id="2" name="Picture 2"/>
             <wp:cNvGraphicFramePr>
               <a:graphicFrameLocks xmlns:a="http://schemas.openxmlformats.org/drawingml/2006/main" noChangeAspect="1"/>
             </wp:cNvGraphicFramePr>
@@ -138,28 +103,24 @@
       <w:pPr>
         <w:pStyle w:val="Heading2"/>
       </w:pPr>
-      <w:proofErr w:type="gramStart"/>
-      <w:r>
-        <w:rPr>
-          <w:rFonts w:ascii="Arial" w:hAnsi="Arial" w:cs="Arial"/>
-        </w:rPr>
-        <w:t>docker</w:t>
-      </w:r>
-      <w:proofErr w:type="gramEnd"/>
-      <w:r>
-        <w:rPr>
-          <w:rFonts w:ascii="Arial" w:hAnsi="Arial" w:cs="Arial"/>
-        </w:rPr>
-        <w:t xml:space="preserve"> pull nginx</w:t>
-      </w:r>
-    </w:p>
-    <w:p>
-      <w:r>
+      <w:r>
+        <w:rPr>
+          <w:rFonts w:ascii="Arial" w:hAnsi="Arial" w:cs="Arial"/>
+        </w:rPr>
+        <w:lastRenderedPageBreak/>
+        <w:t>docker run hello-world</w:t>
+      </w:r>
+    </w:p>
+    <w:p>
+      <w:r>
+        <w:rPr>
+          <w:noProof/>
+        </w:rPr>
         <w:drawing>
-          <wp:inline distT="0" distB="0" distL="0" distR="0" wp14:anchorId="0918B7B7" wp14:editId="633864AB">
+          <wp:inline distT="0" distB="0" distL="0" distR="0" wp14:anchorId="78B083CB" wp14:editId="0813BCD5">
             <wp:extent cx="5943600" cy="3343275"/>
             <wp:effectExtent l="0" t="0" r="0" b="9525"/>
-            <wp:docPr id="3" name="Picture 3"/>
+            <wp:docPr id="2" name="Picture 2"/>
             <wp:cNvGraphicFramePr>
               <a:graphicFrameLocks xmlns:a="http://schemas.openxmlformats.org/drawingml/2006/main" noChangeAspect="1"/>
             </wp:cNvGraphicFramePr>
@@ -201,7 +162,6 @@
         <w:rPr>
           <w:rFonts w:ascii="Arial" w:hAnsi="Arial" w:cs="Arial"/>
         </w:rPr>
-        <w:lastRenderedPageBreak/>
         <w:t>docker</w:t>
       </w:r>
       <w:proofErr w:type="gramEnd"/>
@@ -209,16 +169,19 @@
         <w:rPr>
           <w:rFonts w:ascii="Arial" w:hAnsi="Arial" w:cs="Arial"/>
         </w:rPr>
-        <w:t xml:space="preserve"> images</w:t>
-      </w:r>
-    </w:p>
-    <w:p>
-      <w:r>
+        <w:t xml:space="preserve"> pull nginx</w:t>
+      </w:r>
+    </w:p>
+    <w:p>
+      <w:r>
+        <w:rPr>
+          <w:noProof/>
+        </w:rPr>
         <w:drawing>
-          <wp:inline distT="0" distB="0" distL="0" distR="0" wp14:anchorId="731BE5E0" wp14:editId="008683C9">
+          <wp:inline distT="0" distB="0" distL="0" distR="0" wp14:anchorId="0918B7B7" wp14:editId="633864AB">
             <wp:extent cx="5943600" cy="3343275"/>
             <wp:effectExtent l="0" t="0" r="0" b="9525"/>
-            <wp:docPr id="4" name="Picture 4"/>
+            <wp:docPr id="3" name="Picture 3"/>
             <wp:cNvGraphicFramePr>
               <a:graphicFrameLocks xmlns:a="http://schemas.openxmlformats.org/drawingml/2006/main" noChangeAspect="1"/>
             </wp:cNvGraphicFramePr>
@@ -260,6 +223,7 @@
         <w:rPr>
           <w:rFonts w:ascii="Arial" w:hAnsi="Arial" w:cs="Arial"/>
         </w:rPr>
+        <w:lastRenderedPageBreak/>
         <w:t>docker</w:t>
       </w:r>
       <w:proofErr w:type="gramEnd"/>
@@ -267,16 +231,19 @@
         <w:rPr>
           <w:rFonts w:ascii="Arial" w:hAnsi="Arial" w:cs="Arial"/>
         </w:rPr>
-        <w:t xml:space="preserve"> run -d nginx</w:t>
-      </w:r>
-    </w:p>
-    <w:p>
-      <w:r>
+        <w:t xml:space="preserve"> images</w:t>
+      </w:r>
+    </w:p>
+    <w:p>
+      <w:r>
+        <w:rPr>
+          <w:noProof/>
+        </w:rPr>
         <w:drawing>
-          <wp:inline distT="0" distB="0" distL="0" distR="0" wp14:anchorId="3D292810" wp14:editId="2B2D8B60">
+          <wp:inline distT="0" distB="0" distL="0" distR="0" wp14:anchorId="731BE5E0" wp14:editId="008683C9">
             <wp:extent cx="5943600" cy="3343275"/>
             <wp:effectExtent l="0" t="0" r="0" b="9525"/>
-            <wp:docPr id="5" name="Picture 5"/>
+            <wp:docPr id="4" name="Picture 4"/>
             <wp:cNvGraphicFramePr>
               <a:graphicFrameLocks xmlns:a="http://schemas.openxmlformats.org/drawingml/2006/main" noChangeAspect="1"/>
             </wp:cNvGraphicFramePr>
@@ -310,12 +277,34 @@
       </w:r>
     </w:p>
     <w:p>
-      <w:r>
+      <w:pPr>
+        <w:pStyle w:val="Heading2"/>
+      </w:pPr>
+      <w:proofErr w:type="gramStart"/>
+      <w:r>
+        <w:rPr>
+          <w:rFonts w:ascii="Arial" w:hAnsi="Arial" w:cs="Arial"/>
+        </w:rPr>
+        <w:t>docker</w:t>
+      </w:r>
+      <w:proofErr w:type="gramEnd"/>
+      <w:r>
+        <w:rPr>
+          <w:rFonts w:ascii="Arial" w:hAnsi="Arial" w:cs="Arial"/>
+        </w:rPr>
+        <w:t xml:space="preserve"> run -d nginx</w:t>
+      </w:r>
+    </w:p>
+    <w:p>
+      <w:r>
+        <w:rPr>
+          <w:noProof/>
+        </w:rPr>
         <w:drawing>
-          <wp:inline distT="0" distB="0" distL="0" distR="0" wp14:anchorId="33285611" wp14:editId="2F4706F1">
-            <wp:extent cx="5544324" cy="657317"/>
+          <wp:inline distT="0" distB="0" distL="0" distR="0" wp14:anchorId="3D292810" wp14:editId="2B2D8B60">
+            <wp:extent cx="5943600" cy="3343275"/>
             <wp:effectExtent l="0" t="0" r="0" b="9525"/>
-            <wp:docPr id="6" name="Picture 6"/>
+            <wp:docPr id="5" name="Picture 5"/>
             <wp:cNvGraphicFramePr>
               <a:graphicFrameLocks xmlns:a="http://schemas.openxmlformats.org/drawingml/2006/main" noChangeAspect="1"/>
             </wp:cNvGraphicFramePr>
@@ -335,7 +324,7 @@
                   <pic:spPr>
                     <a:xfrm>
                       <a:off x="0" y="0"/>
-                      <a:ext cx="5544324" cy="657317"/>
+                      <a:ext cx="5943600" cy="3343275"/>
                     </a:xfrm>
                     <a:prstGeom prst="rect">
                       <a:avLst/>
@@ -349,32 +338,15 @@
       </w:r>
     </w:p>
     <w:p>
-      <w:pPr>
-        <w:pStyle w:val="Heading2"/>
-      </w:pPr>
-      <w:proofErr w:type="gramStart"/>
-      <w:r>
-        <w:rPr>
-          <w:rFonts w:ascii="Arial" w:hAnsi="Arial" w:cs="Arial"/>
-        </w:rPr>
-        <w:lastRenderedPageBreak/>
-        <w:t>docker</w:t>
-      </w:r>
-      <w:proofErr w:type="gramEnd"/>
-      <w:r>
-        <w:rPr>
-          <w:rFonts w:ascii="Arial" w:hAnsi="Arial" w:cs="Arial"/>
-        </w:rPr>
-        <w:t xml:space="preserve"> ps</w:t>
-      </w:r>
-    </w:p>
-    <w:p>
-      <w:r>
+      <w:r>
+        <w:rPr>
+          <w:noProof/>
+        </w:rPr>
         <w:drawing>
-          <wp:inline distT="0" distB="0" distL="0" distR="0" wp14:anchorId="7F4915A5" wp14:editId="49E67162">
-            <wp:extent cx="5943600" cy="671830"/>
-            <wp:effectExtent l="0" t="0" r="0" b="0"/>
-            <wp:docPr id="7" name="Picture 7"/>
+          <wp:inline distT="0" distB="0" distL="0" distR="0" wp14:anchorId="33285611" wp14:editId="2F4706F1">
+            <wp:extent cx="5544324" cy="657317"/>
+            <wp:effectExtent l="0" t="0" r="0" b="9525"/>
+            <wp:docPr id="6" name="Picture 6"/>
             <wp:cNvGraphicFramePr>
               <a:graphicFrameLocks xmlns:a="http://schemas.openxmlformats.org/drawingml/2006/main" noChangeAspect="1"/>
             </wp:cNvGraphicFramePr>
@@ -394,7 +366,7 @@
                   <pic:spPr>
                     <a:xfrm>
                       <a:off x="0" y="0"/>
-                      <a:ext cx="5943600" cy="671830"/>
+                      <a:ext cx="5544324" cy="657317"/>
                     </a:xfrm>
                     <a:prstGeom prst="rect">
                       <a:avLst/>
@@ -416,6 +388,7 @@
         <w:rPr>
           <w:rFonts w:ascii="Arial" w:hAnsi="Arial" w:cs="Arial"/>
         </w:rPr>
+        <w:lastRenderedPageBreak/>
         <w:t>docker</w:t>
       </w:r>
       <w:proofErr w:type="gramEnd"/>
@@ -423,16 +396,19 @@
         <w:rPr>
           <w:rFonts w:ascii="Arial" w:hAnsi="Arial" w:cs="Arial"/>
         </w:rPr>
-        <w:t xml:space="preserve"> ps -a</w:t>
-      </w:r>
-    </w:p>
-    <w:p>
-      <w:r>
+        <w:t xml:space="preserve"> ps</w:t>
+      </w:r>
+    </w:p>
+    <w:p>
+      <w:r>
+        <w:rPr>
+          <w:noProof/>
+        </w:rPr>
         <w:drawing>
-          <wp:inline distT="0" distB="0" distL="0" distR="0" wp14:anchorId="63D65DE3" wp14:editId="7D417CB8">
-            <wp:extent cx="5943600" cy="599440"/>
+          <wp:inline distT="0" distB="0" distL="0" distR="0" wp14:anchorId="7F4915A5" wp14:editId="49E67162">
+            <wp:extent cx="5943600" cy="671830"/>
             <wp:effectExtent l="0" t="0" r="0" b="0"/>
-            <wp:docPr id="8" name="Picture 8"/>
+            <wp:docPr id="7" name="Picture 7"/>
             <wp:cNvGraphicFramePr>
               <a:graphicFrameLocks xmlns:a="http://schemas.openxmlformats.org/drawingml/2006/main" noChangeAspect="1"/>
             </wp:cNvGraphicFramePr>
@@ -452,7 +428,7 @@
                   <pic:spPr>
                     <a:xfrm>
                       <a:off x="0" y="0"/>
-                      <a:ext cx="5943600" cy="599440"/>
+                      <a:ext cx="5943600" cy="671830"/>
                     </a:xfrm>
                     <a:prstGeom prst="rect">
                       <a:avLst/>
@@ -481,16 +457,19 @@
         <w:rPr>
           <w:rFonts w:ascii="Arial" w:hAnsi="Arial" w:cs="Arial"/>
         </w:rPr>
-        <w:t xml:space="preserve"> logs &lt;container_id&gt;</w:t>
-      </w:r>
-    </w:p>
-    <w:p>
-      <w:r>
+        <w:t xml:space="preserve"> ps -a</w:t>
+      </w:r>
+    </w:p>
+    <w:p>
+      <w:r>
+        <w:rPr>
+          <w:noProof/>
+        </w:rPr>
         <w:drawing>
-          <wp:inline distT="0" distB="0" distL="0" distR="0" wp14:anchorId="5700728D" wp14:editId="6E994C8B">
-            <wp:extent cx="5943600" cy="2655570"/>
+          <wp:inline distT="0" distB="0" distL="0" distR="0" wp14:anchorId="63D65DE3" wp14:editId="7D417CB8">
+            <wp:extent cx="5943600" cy="599440"/>
             <wp:effectExtent l="0" t="0" r="0" b="0"/>
-            <wp:docPr id="9" name="Picture 9"/>
+            <wp:docPr id="8" name="Picture 8"/>
             <wp:cNvGraphicFramePr>
               <a:graphicFrameLocks xmlns:a="http://schemas.openxmlformats.org/drawingml/2006/main" noChangeAspect="1"/>
             </wp:cNvGraphicFramePr>
@@ -510,7 +489,7 @@
                   <pic:spPr>
                     <a:xfrm>
                       <a:off x="0" y="0"/>
-                      <a:ext cx="5943600" cy="2655570"/>
+                      <a:ext cx="5943600" cy="599440"/>
                     </a:xfrm>
                     <a:prstGeom prst="rect">
                       <a:avLst/>
@@ -532,7 +511,6 @@
         <w:rPr>
           <w:rFonts w:ascii="Arial" w:hAnsi="Arial" w:cs="Arial"/>
         </w:rPr>
-        <w:lastRenderedPageBreak/>
         <w:t>docker</w:t>
       </w:r>
       <w:proofErr w:type="gramEnd"/>
@@ -540,16 +518,19 @@
         <w:rPr>
           <w:rFonts w:ascii="Arial" w:hAnsi="Arial" w:cs="Arial"/>
         </w:rPr>
-        <w:t xml:space="preserve"> exec -it &lt;container_id&gt; /bin/sh</w:t>
-      </w:r>
-    </w:p>
-    <w:p>
-      <w:r>
+        <w:t xml:space="preserve"> logs &lt;container_id&gt;</w:t>
+      </w:r>
+    </w:p>
+    <w:p>
+      <w:r>
+        <w:rPr>
+          <w:noProof/>
+        </w:rPr>
         <w:drawing>
-          <wp:inline distT="0" distB="0" distL="0" distR="0" wp14:anchorId="56DA908B" wp14:editId="6FF7A5D3">
-            <wp:extent cx="5943600" cy="3343275"/>
-            <wp:effectExtent l="0" t="0" r="0" b="9525"/>
-            <wp:docPr id="10" name="Picture 10"/>
+          <wp:inline distT="0" distB="0" distL="0" distR="0" wp14:anchorId="5700728D" wp14:editId="6E994C8B">
+            <wp:extent cx="5943600" cy="2655570"/>
+            <wp:effectExtent l="0" t="0" r="0" b="0"/>
+            <wp:docPr id="9" name="Picture 9"/>
             <wp:cNvGraphicFramePr>
               <a:graphicFrameLocks xmlns:a="http://schemas.openxmlformats.org/drawingml/2006/main" noChangeAspect="1"/>
             </wp:cNvGraphicFramePr>
@@ -569,7 +550,7 @@
                   <pic:spPr>
                     <a:xfrm>
                       <a:off x="0" y="0"/>
-                      <a:ext cx="5943600" cy="3343275"/>
+                      <a:ext cx="5943600" cy="2655570"/>
                     </a:xfrm>
                     <a:prstGeom prst="rect">
                       <a:avLst/>
@@ -591,6 +572,7 @@
         <w:rPr>
           <w:rFonts w:ascii="Arial" w:hAnsi="Arial" w:cs="Arial"/>
         </w:rPr>
+        <w:lastRenderedPageBreak/>
         <w:t>docker</w:t>
       </w:r>
       <w:proofErr w:type="gramEnd"/>
@@ -598,16 +580,19 @@
         <w:rPr>
           <w:rFonts w:ascii="Arial" w:hAnsi="Arial" w:cs="Arial"/>
         </w:rPr>
-        <w:t xml:space="preserve"> stop &lt;container_id&gt;</w:t>
-      </w:r>
-    </w:p>
-    <w:p>
-      <w:r>
+        <w:t xml:space="preserve"> exec -it &lt;container_id&gt; /bin/sh</w:t>
+      </w:r>
+    </w:p>
+    <w:p>
+      <w:r>
+        <w:rPr>
+          <w:noProof/>
+        </w:rPr>
         <w:drawing>
-          <wp:inline distT="0" distB="0" distL="0" distR="0" wp14:anchorId="3E0B14B0" wp14:editId="58B42C8F">
+          <wp:inline distT="0" distB="0" distL="0" distR="0" wp14:anchorId="56DA908B" wp14:editId="6FF7A5D3">
             <wp:extent cx="5943600" cy="3343275"/>
             <wp:effectExtent l="0" t="0" r="0" b="9525"/>
-            <wp:docPr id="11" name="Picture 11"/>
+            <wp:docPr id="10" name="Picture 10"/>
             <wp:cNvGraphicFramePr>
               <a:graphicFrameLocks xmlns:a="http://schemas.openxmlformats.org/drawingml/2006/main" noChangeAspect="1"/>
             </wp:cNvGraphicFramePr>
@@ -649,7 +634,6 @@
         <w:rPr>
           <w:rFonts w:ascii="Arial" w:hAnsi="Arial" w:cs="Arial"/>
         </w:rPr>
-        <w:lastRenderedPageBreak/>
         <w:t>docker</w:t>
       </w:r>
       <w:proofErr w:type="gramEnd"/>
@@ -657,16 +641,19 @@
         <w:rPr>
           <w:rFonts w:ascii="Arial" w:hAnsi="Arial" w:cs="Arial"/>
         </w:rPr>
-        <w:t xml:space="preserve"> restart &lt;container_id&gt;</w:t>
-      </w:r>
-    </w:p>
-    <w:p>
-      <w:r>
+        <w:t xml:space="preserve"> stop &lt;container_id&gt;</w:t>
+      </w:r>
+    </w:p>
+    <w:p>
+      <w:r>
+        <w:rPr>
+          <w:noProof/>
+        </w:rPr>
         <w:drawing>
-          <wp:inline distT="0" distB="0" distL="0" distR="0" wp14:anchorId="4A63C71E" wp14:editId="4F6F6864">
+          <wp:inline distT="0" distB="0" distL="0" distR="0" wp14:anchorId="3E0B14B0" wp14:editId="58B42C8F">
             <wp:extent cx="5943600" cy="3343275"/>
             <wp:effectExtent l="0" t="0" r="0" b="9525"/>
-            <wp:docPr id="12" name="Picture 12"/>
+            <wp:docPr id="11" name="Picture 11"/>
             <wp:cNvGraphicFramePr>
               <a:graphicFrameLocks xmlns:a="http://schemas.openxmlformats.org/drawingml/2006/main" noChangeAspect="1"/>
             </wp:cNvGraphicFramePr>
@@ -705,20 +692,30 @@
       </w:pPr>
       <w:proofErr w:type="gramStart"/>
       <w:r>
+        <w:rPr>
+          <w:rFonts w:ascii="Arial" w:hAnsi="Arial" w:cs="Arial"/>
+        </w:rPr>
+        <w:lastRenderedPageBreak/>
         <w:t>docker</w:t>
       </w:r>
       <w:proofErr w:type="gramEnd"/>
       <w:r>
-        <w:t xml:space="preserve"> rm &lt;container_id&gt;</w:t>
-      </w:r>
-    </w:p>
-    <w:p>
-      <w:r>
+        <w:rPr>
+          <w:rFonts w:ascii="Arial" w:hAnsi="Arial" w:cs="Arial"/>
+        </w:rPr>
+        <w:t xml:space="preserve"> restart &lt;container_id&gt;</w:t>
+      </w:r>
+    </w:p>
+    <w:p>
+      <w:r>
+        <w:rPr>
+          <w:noProof/>
+        </w:rPr>
         <w:drawing>
-          <wp:inline distT="0" distB="0" distL="0" distR="0" wp14:anchorId="0C5B7BE4" wp14:editId="5A0BD1C1">
+          <wp:inline distT="0" distB="0" distL="0" distR="0" wp14:anchorId="4A63C71E" wp14:editId="4F6F6864">
             <wp:extent cx="5943600" cy="3343275"/>
             <wp:effectExtent l="0" t="0" r="0" b="9525"/>
-            <wp:docPr id="13" name="Picture 13"/>
+            <wp:docPr id="12" name="Picture 12"/>
             <wp:cNvGraphicFramePr>
               <a:graphicFrameLocks xmlns:a="http://schemas.openxmlformats.org/drawingml/2006/main" noChangeAspect="1"/>
             </wp:cNvGraphicFramePr>
@@ -751,6 +748,415 @@
         </w:drawing>
       </w:r>
     </w:p>
+    <w:p>
+      <w:pPr>
+        <w:pStyle w:val="Heading2"/>
+      </w:pPr>
+      <w:proofErr w:type="gramStart"/>
+      <w:r>
+        <w:t>docker</w:t>
+      </w:r>
+      <w:proofErr w:type="gramEnd"/>
+      <w:r>
+        <w:t xml:space="preserve"> rm &lt;container_id&gt;</w:t>
+      </w:r>
+    </w:p>
+    <w:p>
+      <w:r>
+        <w:rPr>
+          <w:noProof/>
+        </w:rPr>
+        <w:drawing>
+          <wp:inline distT="0" distB="0" distL="0" distR="0" wp14:anchorId="0C5B7BE4" wp14:editId="5A0BD1C1">
+            <wp:extent cx="5943600" cy="3343275"/>
+            <wp:effectExtent l="0" t="0" r="0" b="9525"/>
+            <wp:docPr id="13" name="Picture 13"/>
+            <wp:cNvGraphicFramePr>
+              <a:graphicFrameLocks xmlns:a="http://schemas.openxmlformats.org/drawingml/2006/main" noChangeAspect="1"/>
+            </wp:cNvGraphicFramePr>
+            <a:graphic xmlns:a="http://schemas.openxmlformats.org/drawingml/2006/main">
+              <a:graphicData uri="http://schemas.openxmlformats.org/drawingml/2006/picture">
+                <pic:pic xmlns:pic="http://schemas.openxmlformats.org/drawingml/2006/picture">
+                  <pic:nvPicPr>
+                    <pic:cNvPr id="1" name=""/>
+                    <pic:cNvPicPr/>
+                  </pic:nvPicPr>
+                  <pic:blipFill>
+                    <a:blip r:embed="rId17"/>
+                    <a:stretch>
+                      <a:fillRect/>
+                    </a:stretch>
+                  </pic:blipFill>
+                  <pic:spPr>
+                    <a:xfrm>
+                      <a:off x="0" y="0"/>
+                      <a:ext cx="5943600" cy="3343275"/>
+                    </a:xfrm>
+                    <a:prstGeom prst="rect">
+                      <a:avLst/>
+                    </a:prstGeom>
+                  </pic:spPr>
+                </pic:pic>
+              </a:graphicData>
+            </a:graphic>
+          </wp:inline>
+        </w:drawing>
+      </w:r>
+    </w:p>
+    <w:p>
+      <w:pPr>
+        <w:pStyle w:val="Heading1"/>
+      </w:pPr>
+      <w:r>
+        <w:lastRenderedPageBreak/>
+        <w:t>Phầ</w:t>
+      </w:r>
+      <w:r>
+        <w:t>n 2</w:t>
+      </w:r>
+      <w:r>
+        <w:t xml:space="preserve">: </w:t>
+      </w:r>
+      <w:r>
+        <w:t>Docker Compose file</w:t>
+      </w:r>
+    </w:p>
+    <w:p>
+      <w:pPr>
+        <w:pStyle w:val="Heading2"/>
+        <w:rPr>
+          <w:rFonts w:ascii="Arial" w:hAnsi="Arial" w:cs="Arial"/>
+        </w:rPr>
+      </w:pPr>
+      <w:r>
+        <w:rPr>
+          <w:rFonts w:ascii="Arial" w:hAnsi="Arial" w:cs="Arial"/>
+        </w:rPr>
+        <w:t>Bài 1: Chạy một container đơn giản với Docker Compose</w:t>
+      </w:r>
+    </w:p>
+    <w:p>
+      <w:pPr>
+        <w:pStyle w:val="ListParagraph"/>
+        <w:numPr>
+          <w:ilvl w:val="0"/>
+          <w:numId w:val="1"/>
+        </w:numPr>
+      </w:pPr>
+      <w:r>
+        <w:rPr>
+          <w:b/>
+        </w:rPr>
+        <w:t>Bước 1: Cài file YML (echo. &gt; fileName.yml)</w:t>
+      </w:r>
+    </w:p>
+    <w:p>
+      <w:r>
+        <w:drawing>
+          <wp:inline distT="0" distB="0" distL="0" distR="0" wp14:anchorId="72A58442" wp14:editId="6298F753">
+            <wp:extent cx="3258005" cy="2372056"/>
+            <wp:effectExtent l="0" t="0" r="0" b="9525"/>
+            <wp:docPr id="15" name="Picture 15"/>
+            <wp:cNvGraphicFramePr>
+              <a:graphicFrameLocks xmlns:a="http://schemas.openxmlformats.org/drawingml/2006/main" noChangeAspect="1"/>
+            </wp:cNvGraphicFramePr>
+            <a:graphic xmlns:a="http://schemas.openxmlformats.org/drawingml/2006/main">
+              <a:graphicData uri="http://schemas.openxmlformats.org/drawingml/2006/picture">
+                <pic:pic xmlns:pic="http://schemas.openxmlformats.org/drawingml/2006/picture">
+                  <pic:nvPicPr>
+                    <pic:cNvPr id="1" name=""/>
+                    <pic:cNvPicPr/>
+                  </pic:nvPicPr>
+                  <pic:blipFill>
+                    <a:blip r:embed="rId18"/>
+                    <a:stretch>
+                      <a:fillRect/>
+                    </a:stretch>
+                  </pic:blipFill>
+                  <pic:spPr>
+                    <a:xfrm>
+                      <a:off x="0" y="0"/>
+                      <a:ext cx="3258005" cy="2372056"/>
+                    </a:xfrm>
+                    <a:prstGeom prst="rect">
+                      <a:avLst/>
+                    </a:prstGeom>
+                  </pic:spPr>
+                </pic:pic>
+              </a:graphicData>
+            </a:graphic>
+          </wp:inline>
+        </w:drawing>
+      </w:r>
+    </w:p>
+    <w:p>
+      <w:pPr>
+        <w:pStyle w:val="ListParagraph"/>
+        <w:numPr>
+          <w:ilvl w:val="0"/>
+          <w:numId w:val="1"/>
+        </w:numPr>
+      </w:pPr>
+      <w:r>
+        <w:rPr>
+          <w:b/>
+        </w:rPr>
+        <w:t>Bướ</w:t>
+      </w:r>
+      <w:r>
+        <w:rPr>
+          <w:b/>
+        </w:rPr>
+        <w:t>c 2</w:t>
+      </w:r>
+      <w:r>
+        <w:rPr>
+          <w:b/>
+        </w:rPr>
+        <w:t xml:space="preserve">: </w:t>
+      </w:r>
+      <w:r>
+        <w:rPr>
+          <w:b/>
+        </w:rPr>
+        <w:t>Start Container</w:t>
+      </w:r>
+    </w:p>
+    <w:p>
+      <w:r>
+        <w:drawing>
+          <wp:inline distT="0" distB="0" distL="0" distR="0" wp14:anchorId="12D3360A" wp14:editId="0A64C97C">
+            <wp:extent cx="5943600" cy="3343275"/>
+            <wp:effectExtent l="0" t="0" r="0" b="9525"/>
+            <wp:docPr id="16" name="Picture 16"/>
+            <wp:cNvGraphicFramePr>
+              <a:graphicFrameLocks xmlns:a="http://schemas.openxmlformats.org/drawingml/2006/main" noChangeAspect="1"/>
+            </wp:cNvGraphicFramePr>
+            <a:graphic xmlns:a="http://schemas.openxmlformats.org/drawingml/2006/main">
+              <a:graphicData uri="http://schemas.openxmlformats.org/drawingml/2006/picture">
+                <pic:pic xmlns:pic="http://schemas.openxmlformats.org/drawingml/2006/picture">
+                  <pic:nvPicPr>
+                    <pic:cNvPr id="1" name=""/>
+                    <pic:cNvPicPr/>
+                  </pic:nvPicPr>
+                  <pic:blipFill>
+                    <a:blip r:embed="rId19"/>
+                    <a:stretch>
+                      <a:fillRect/>
+                    </a:stretch>
+                  </pic:blipFill>
+                  <pic:spPr>
+                    <a:xfrm>
+                      <a:off x="0" y="0"/>
+                      <a:ext cx="5943600" cy="3343275"/>
+                    </a:xfrm>
+                    <a:prstGeom prst="rect">
+                      <a:avLst/>
+                    </a:prstGeom>
+                  </pic:spPr>
+                </pic:pic>
+              </a:graphicData>
+            </a:graphic>
+          </wp:inline>
+        </w:drawing>
+      </w:r>
+    </w:p>
+    <w:p>
+      <w:pPr>
+        <w:pStyle w:val="ListParagraph"/>
+        <w:numPr>
+          <w:ilvl w:val="0"/>
+          <w:numId w:val="1"/>
+        </w:numPr>
+      </w:pPr>
+      <w:r>
+        <w:rPr>
+          <w:b/>
+        </w:rPr>
+        <w:t>Bướ</w:t>
+      </w:r>
+      <w:r>
+        <w:rPr>
+          <w:b/>
+        </w:rPr>
+        <w:t>c 3</w:t>
+      </w:r>
+      <w:r>
+        <w:rPr>
+          <w:b/>
+        </w:rPr>
+        <w:t xml:space="preserve">: </w:t>
+      </w:r>
+      <w:r>
+        <w:rPr>
+          <w:b/>
+        </w:rPr>
+        <w:t>Kết quả</w:t>
+      </w:r>
+    </w:p>
+    <w:p>
+      <w:r>
+        <w:lastRenderedPageBreak/>
+        <w:drawing>
+          <wp:inline distT="0" distB="0" distL="0" distR="0" wp14:anchorId="31AD2CEE" wp14:editId="3BD1C652">
+            <wp:extent cx="5943600" cy="3343275"/>
+            <wp:effectExtent l="0" t="0" r="0" b="9525"/>
+            <wp:docPr id="14" name="Picture 14"/>
+            <wp:cNvGraphicFramePr>
+              <a:graphicFrameLocks xmlns:a="http://schemas.openxmlformats.org/drawingml/2006/main" noChangeAspect="1"/>
+            </wp:cNvGraphicFramePr>
+            <a:graphic xmlns:a="http://schemas.openxmlformats.org/drawingml/2006/main">
+              <a:graphicData uri="http://schemas.openxmlformats.org/drawingml/2006/picture">
+                <pic:pic xmlns:pic="http://schemas.openxmlformats.org/drawingml/2006/picture">
+                  <pic:nvPicPr>
+                    <pic:cNvPr id="1" name=""/>
+                    <pic:cNvPicPr/>
+                  </pic:nvPicPr>
+                  <pic:blipFill>
+                    <a:blip r:embed="rId20"/>
+                    <a:stretch>
+                      <a:fillRect/>
+                    </a:stretch>
+                  </pic:blipFill>
+                  <pic:spPr>
+                    <a:xfrm>
+                      <a:off x="0" y="0"/>
+                      <a:ext cx="5943600" cy="3343275"/>
+                    </a:xfrm>
+                    <a:prstGeom prst="rect">
+                      <a:avLst/>
+                    </a:prstGeom>
+                  </pic:spPr>
+                </pic:pic>
+              </a:graphicData>
+            </a:graphic>
+          </wp:inline>
+        </w:drawing>
+      </w:r>
+    </w:p>
+    <w:p>
+      <w:pPr>
+        <w:pStyle w:val="ListParagraph"/>
+        <w:numPr>
+          <w:ilvl w:val="0"/>
+          <w:numId w:val="1"/>
+        </w:numPr>
+      </w:pPr>
+      <w:r>
+        <w:rPr>
+          <w:b/>
+        </w:rPr>
+        <w:t xml:space="preserve">Bước 3: </w:t>
+      </w:r>
+      <w:r>
+        <w:rPr>
+          <w:b/>
+        </w:rPr>
+        <w:t>Check localhost:8080</w:t>
+      </w:r>
+    </w:p>
+    <w:p>
+      <w:r>
+        <w:drawing>
+          <wp:inline distT="0" distB="0" distL="0" distR="0" wp14:anchorId="39AD7398" wp14:editId="40C7E1F0">
+            <wp:extent cx="5943600" cy="3343275"/>
+            <wp:effectExtent l="0" t="0" r="0" b="9525"/>
+            <wp:docPr id="18" name="Picture 18"/>
+            <wp:cNvGraphicFramePr>
+              <a:graphicFrameLocks xmlns:a="http://schemas.openxmlformats.org/drawingml/2006/main" noChangeAspect="1"/>
+            </wp:cNvGraphicFramePr>
+            <a:graphic xmlns:a="http://schemas.openxmlformats.org/drawingml/2006/main">
+              <a:graphicData uri="http://schemas.openxmlformats.org/drawingml/2006/picture">
+                <pic:pic xmlns:pic="http://schemas.openxmlformats.org/drawingml/2006/picture">
+                  <pic:nvPicPr>
+                    <pic:cNvPr id="1" name=""/>
+                    <pic:cNvPicPr/>
+                  </pic:nvPicPr>
+                  <pic:blipFill>
+                    <a:blip r:embed="rId21"/>
+                    <a:stretch>
+                      <a:fillRect/>
+                    </a:stretch>
+                  </pic:blipFill>
+                  <pic:spPr>
+                    <a:xfrm>
+                      <a:off x="0" y="0"/>
+                      <a:ext cx="5943600" cy="3343275"/>
+                    </a:xfrm>
+                    <a:prstGeom prst="rect">
+                      <a:avLst/>
+                    </a:prstGeom>
+                  </pic:spPr>
+                </pic:pic>
+              </a:graphicData>
+            </a:graphic>
+          </wp:inline>
+        </w:drawing>
+      </w:r>
+    </w:p>
+    <w:p>
+      <w:r>
+        <w:lastRenderedPageBreak/>
+        <w:drawing>
+          <wp:inline distT="0" distB="0" distL="0" distR="0" wp14:anchorId="03896987" wp14:editId="49A214B8">
+            <wp:extent cx="5943600" cy="6661785"/>
+            <wp:effectExtent l="0" t="0" r="0" b="5715"/>
+            <wp:docPr id="17" name="Picture 17"/>
+            <wp:cNvGraphicFramePr>
+              <a:graphicFrameLocks xmlns:a="http://schemas.openxmlformats.org/drawingml/2006/main" noChangeAspect="1"/>
+            </wp:cNvGraphicFramePr>
+            <a:graphic xmlns:a="http://schemas.openxmlformats.org/drawingml/2006/main">
+              <a:graphicData uri="http://schemas.openxmlformats.org/drawingml/2006/picture">
+                <pic:pic xmlns:pic="http://schemas.openxmlformats.org/drawingml/2006/picture">
+                  <pic:nvPicPr>
+                    <pic:cNvPr id="1" name=""/>
+                    <pic:cNvPicPr/>
+                  </pic:nvPicPr>
+                  <pic:blipFill>
+                    <a:blip r:embed="rId22"/>
+                    <a:stretch>
+                      <a:fillRect/>
+                    </a:stretch>
+                  </pic:blipFill>
+                  <pic:spPr>
+                    <a:xfrm>
+                      <a:off x="0" y="0"/>
+                      <a:ext cx="5943600" cy="6661785"/>
+                    </a:xfrm>
+                    <a:prstGeom prst="rect">
+                      <a:avLst/>
+                    </a:prstGeom>
+                  </pic:spPr>
+                </pic:pic>
+              </a:graphicData>
+            </a:graphic>
+          </wp:inline>
+        </w:drawing>
+      </w:r>
+      <w:bookmarkStart w:id="0" w:name="_GoBack"/>
+      <w:bookmarkEnd w:id="0"/>
+    </w:p>
+    <w:p>
+      <w:pPr>
+        <w:pStyle w:val="Heading2"/>
+        <w:rPr>
+          <w:rFonts w:ascii="Arial" w:hAnsi="Arial" w:cs="Arial"/>
+        </w:rPr>
+      </w:pPr>
+      <w:r>
+        <w:rPr>
+          <w:rFonts w:ascii="Arial" w:hAnsi="Arial" w:cs="Arial"/>
+        </w:rPr>
+        <w:t xml:space="preserve">Bài 2: </w:t>
+      </w:r>
+      <w:r>
+        <w:rPr>
+          <w:rFonts w:ascii="Arial" w:hAnsi="Arial" w:cs="Arial"/>
+        </w:rPr>
+        <w:t>Chạy MySQL với Docker Compose</w:t>
+      </w:r>
+    </w:p>
+    <w:p/>
     <w:sectPr>
       <w:pgSz w:w="12240" w:h="15840"/>
       <w:pgMar w:top="1440" w:right="1440" w:bottom="1440" w:left="1440" w:header="720" w:footer="720" w:gutter="0"/>
@@ -759,6 +1165,126 @@
     </w:sectPr>
   </w:body>
 </w:document>
+</file>
+
+<file path=word/numbering.xml><?xml version="1.0" encoding="utf-8"?>
+<w:numbering xmlns:wpc="http://schemas.microsoft.com/office/word/2010/wordprocessingCanvas" xmlns:mc="http://schemas.openxmlformats.org/markup-compatibility/2006" xmlns:o="urn:schemas-microsoft-com:office:office" xmlns:r="http://schemas.openxmlformats.org/officeDocument/2006/relationships" xmlns:m="http://schemas.openxmlformats.org/officeDocument/2006/math" xmlns:v="urn:schemas-microsoft-com:vml" xmlns:wp14="http://schemas.microsoft.com/office/word/2010/wordprocessingDrawing" xmlns:wp="http://schemas.openxmlformats.org/drawingml/2006/wordprocessingDrawing" xmlns:w10="urn:schemas-microsoft-com:office:word" xmlns:w="http://schemas.openxmlformats.org/wordprocessingml/2006/main" xmlns:w14="http://schemas.microsoft.com/office/word/2010/wordml" xmlns:w15="http://schemas.microsoft.com/office/word/2012/wordml" xmlns:wpg="http://schemas.microsoft.com/office/word/2010/wordprocessingGroup" xmlns:wpi="http://schemas.microsoft.com/office/word/2010/wordprocessingInk" xmlns:wne="http://schemas.microsoft.com/office/word/2006/wordml" xmlns:wps="http://schemas.microsoft.com/office/word/2010/wordprocessingShape" mc:Ignorable="w14 w15 wp14">
+  <w:abstractNum w:abstractNumId="0">
+    <w:nsid w:val="6A7E3381"/>
+    <w:multiLevelType w:val="hybridMultilevel"/>
+    <w:tmpl w:val="2DF0BA26"/>
+    <w:lvl w:ilvl="0" w:tplc="AF7A5FE4">
+      <w:numFmt w:val="bullet"/>
+      <w:lvlText w:val="-"/>
+      <w:lvlJc w:val="left"/>
+      <w:pPr>
+        <w:ind w:left="720" w:hanging="360"/>
+      </w:pPr>
+      <w:rPr>
+        <w:rFonts w:ascii="Times New Roman" w:eastAsiaTheme="minorHAnsi" w:hAnsi="Times New Roman" w:cs="Times New Roman" w:hint="default"/>
+      </w:rPr>
+    </w:lvl>
+    <w:lvl w:ilvl="1" w:tplc="04090003" w:tentative="1">
+      <w:start w:val="1"/>
+      <w:numFmt w:val="bullet"/>
+      <w:lvlText w:val="o"/>
+      <w:lvlJc w:val="left"/>
+      <w:pPr>
+        <w:ind w:left="1440" w:hanging="360"/>
+      </w:pPr>
+      <w:rPr>
+        <w:rFonts w:ascii="Courier New" w:hAnsi="Courier New" w:cs="Courier New" w:hint="default"/>
+      </w:rPr>
+    </w:lvl>
+    <w:lvl w:ilvl="2" w:tplc="04090005" w:tentative="1">
+      <w:start w:val="1"/>
+      <w:numFmt w:val="bullet"/>
+      <w:lvlText w:val=""/>
+      <w:lvlJc w:val="left"/>
+      <w:pPr>
+        <w:ind w:left="2160" w:hanging="360"/>
+      </w:pPr>
+      <w:rPr>
+        <w:rFonts w:ascii="Wingdings" w:hAnsi="Wingdings" w:hint="default"/>
+      </w:rPr>
+    </w:lvl>
+    <w:lvl w:ilvl="3" w:tplc="04090001" w:tentative="1">
+      <w:start w:val="1"/>
+      <w:numFmt w:val="bullet"/>
+      <w:lvlText w:val=""/>
+      <w:lvlJc w:val="left"/>
+      <w:pPr>
+        <w:ind w:left="2880" w:hanging="360"/>
+      </w:pPr>
+      <w:rPr>
+        <w:rFonts w:ascii="Symbol" w:hAnsi="Symbol" w:hint="default"/>
+      </w:rPr>
+    </w:lvl>
+    <w:lvl w:ilvl="4" w:tplc="04090003" w:tentative="1">
+      <w:start w:val="1"/>
+      <w:numFmt w:val="bullet"/>
+      <w:lvlText w:val="o"/>
+      <w:lvlJc w:val="left"/>
+      <w:pPr>
+        <w:ind w:left="3600" w:hanging="360"/>
+      </w:pPr>
+      <w:rPr>
+        <w:rFonts w:ascii="Courier New" w:hAnsi="Courier New" w:cs="Courier New" w:hint="default"/>
+      </w:rPr>
+    </w:lvl>
+    <w:lvl w:ilvl="5" w:tplc="04090005" w:tentative="1">
+      <w:start w:val="1"/>
+      <w:numFmt w:val="bullet"/>
+      <w:lvlText w:val=""/>
+      <w:lvlJc w:val="left"/>
+      <w:pPr>
+        <w:ind w:left="4320" w:hanging="360"/>
+      </w:pPr>
+      <w:rPr>
+        <w:rFonts w:ascii="Wingdings" w:hAnsi="Wingdings" w:hint="default"/>
+      </w:rPr>
+    </w:lvl>
+    <w:lvl w:ilvl="6" w:tplc="04090001" w:tentative="1">
+      <w:start w:val="1"/>
+      <w:numFmt w:val="bullet"/>
+      <w:lvlText w:val=""/>
+      <w:lvlJc w:val="left"/>
+      <w:pPr>
+        <w:ind w:left="5040" w:hanging="360"/>
+      </w:pPr>
+      <w:rPr>
+        <w:rFonts w:ascii="Symbol" w:hAnsi="Symbol" w:hint="default"/>
+      </w:rPr>
+    </w:lvl>
+    <w:lvl w:ilvl="7" w:tplc="04090003" w:tentative="1">
+      <w:start w:val="1"/>
+      <w:numFmt w:val="bullet"/>
+      <w:lvlText w:val="o"/>
+      <w:lvlJc w:val="left"/>
+      <w:pPr>
+        <w:ind w:left="5760" w:hanging="360"/>
+      </w:pPr>
+      <w:rPr>
+        <w:rFonts w:ascii="Courier New" w:hAnsi="Courier New" w:cs="Courier New" w:hint="default"/>
+      </w:rPr>
+    </w:lvl>
+    <w:lvl w:ilvl="8" w:tplc="04090005" w:tentative="1">
+      <w:start w:val="1"/>
+      <w:numFmt w:val="bullet"/>
+      <w:lvlText w:val=""/>
+      <w:lvlJc w:val="left"/>
+      <w:pPr>
+        <w:ind w:left="6480" w:hanging="360"/>
+      </w:pPr>
+      <w:rPr>
+        <w:rFonts w:ascii="Wingdings" w:hAnsi="Wingdings" w:hint="default"/>
+      </w:rPr>
+    </w:lvl>
+  </w:abstractNum>
+  <w:num w:numId="1">
+    <w:abstractNumId w:val="0"/>
+  </w:num>
+</w:numbering>
 </file>
 
 <file path=word/styles.xml><?xml version="1.0" encoding="utf-8"?>
@@ -1154,6 +1680,11 @@
   <w:style w:type="paragraph" w:default="1" w:styleId="Normal">
     <w:name w:val="Normal"/>
     <w:qFormat/>
+    <w:rsid w:val="00912081"/>
+    <w:rPr>
+      <w:rFonts w:ascii="Times New Roman" w:hAnsi="Times New Roman"/>
+      <w:sz w:val="26"/>
+    </w:rPr>
   </w:style>
   <w:style w:type="paragraph" w:styleId="Heading1">
     <w:name w:val="heading 1"/>
@@ -1170,7 +1701,7 @@
       <w:outlineLvl w:val="0"/>
     </w:pPr>
     <w:rPr>
-      <w:rFonts w:ascii="Times New Roman" w:eastAsiaTheme="majorEastAsia" w:hAnsi="Times New Roman" w:cstheme="majorBidi"/>
+      <w:rFonts w:eastAsiaTheme="majorEastAsia" w:cstheme="majorBidi"/>
       <w:b/>
       <w:sz w:val="40"/>
       <w:szCs w:val="32"/>
@@ -1192,7 +1723,7 @@
       <w:outlineLvl w:val="1"/>
     </w:pPr>
     <w:rPr>
-      <w:rFonts w:ascii="Times New Roman" w:eastAsiaTheme="majorEastAsia" w:hAnsi="Times New Roman" w:cstheme="majorBidi"/>
+      <w:rFonts w:eastAsiaTheme="majorEastAsia" w:cstheme="majorBidi"/>
       <w:b/>
       <w:sz w:val="32"/>
       <w:szCs w:val="26"/>
@@ -1201,7 +1732,6 @@
   <w:style w:type="character" w:default="1" w:styleId="DefaultParagraphFont">
     <w:name w:val="Default Paragraph Font"/>
     <w:uiPriority w:val="1"/>
-    <w:semiHidden/>
     <w:unhideWhenUsed/>
   </w:style>
   <w:style w:type="table" w:default="1" w:styleId="TableNormal">
@@ -1250,6 +1780,17 @@
       <w:sz w:val="32"/>
       <w:szCs w:val="26"/>
     </w:rPr>
+  </w:style>
+  <w:style w:type="paragraph" w:styleId="ListParagraph">
+    <w:name w:val="List Paragraph"/>
+    <w:basedOn w:val="Normal"/>
+    <w:uiPriority w:val="34"/>
+    <w:qFormat/>
+    <w:rsid w:val="00912081"/>
+    <w:pPr>
+      <w:ind w:left="720"/>
+      <w:contextualSpacing/>
+    </w:pPr>
   </w:style>
 </w:styles>
 </file>

</xml_diff>